<commit_message>
Add image placeholder support and PDF fixes
This commit adds `--images` / `-I` support for inserting sequential images into `{ImagesPlaceholder}` / `{ImagePlaceholder}` in the DOCX template. When images are omitted, the placeholder is removed; BMP files are converted to PNG in-memory because the underlying library does not support BMP directly. It also improves the Word-to-PDF conversion by opening files read-only with alerts disabled, updates documentation, and adds a PowerShell smoke test covering the image insertion flow.
</commit_message>
<xml_diff>
--- a/docx-converter/template.docx
+++ b/docx-converter/template.docx
@@ -4,77 +4,1066 @@
   <w:body>
     <w:p>
       <w:pPr>
+        <w:pStyle w:val="3"/>
+        <w:pBdr>
+          <w:bottom w:val="single" w:color="auto" w:sz="4" w:space="0"/>
+        </w:pBdr>
+        <w:bidi w:val="0"/>
+        <w:jc w:val="center"/>
+        <w:rPr>
+          <w:rFonts w:hint="default"/>
+          <w:lang w:val="en-US"/>
+        </w:rPr>
+      </w:pPr>
+      <w:r>
+        <w:rPr>
+          <w:rFonts w:hint="default"/>
+          <w:lang w:val="en-US"/>
+        </w:rPr>
+        <w:t>{Title}</w:t>
+      </w:r>
+    </w:p>
+    <w:tbl>
+      <w:tblPr>
+        <w:tblStyle w:val="5"/>
+        <w:tblW w:w="0" w:type="auto"/>
+        <w:tblInd w:w="110" w:type="dxa"/>
+        <w:tblBorders>
+          <w:top w:val="single" w:color="auto" w:sz="4" w:space="0"/>
+          <w:left w:val="single" w:color="auto" w:sz="4" w:space="0"/>
+          <w:bottom w:val="single" w:color="auto" w:sz="4" w:space="0"/>
+          <w:right w:val="single" w:color="auto" w:sz="4" w:space="0"/>
+          <w:insideH w:val="single" w:color="auto" w:sz="4" w:space="0"/>
+          <w:insideV w:val="single" w:color="auto" w:sz="4" w:space="0"/>
+        </w:tblBorders>
+        <w:tblLayout w:type="fixed"/>
+        <w:tblCellMar>
+          <w:top w:w="0" w:type="dxa"/>
+          <w:left w:w="108" w:type="dxa"/>
+          <w:bottom w:w="0" w:type="dxa"/>
+          <w:right w:w="108" w:type="dxa"/>
+        </w:tblCellMar>
+      </w:tblPr>
+      <w:tblGrid>
+        <w:gridCol w:w="1450"/>
+        <w:gridCol w:w="1902"/>
+        <w:gridCol w:w="1821"/>
+        <w:gridCol w:w="2272"/>
+        <w:gridCol w:w="1338"/>
+        <w:gridCol w:w="1680"/>
+      </w:tblGrid>
+      <w:tr>
+        <w:tblPrEx>
+          <w:tblBorders>
+            <w:top w:val="single" w:color="auto" w:sz="4" w:space="0"/>
+            <w:left w:val="single" w:color="auto" w:sz="4" w:space="0"/>
+            <w:bottom w:val="single" w:color="auto" w:sz="4" w:space="0"/>
+            <w:right w:val="single" w:color="auto" w:sz="4" w:space="0"/>
+            <w:insideH w:val="single" w:color="auto" w:sz="4" w:space="0"/>
+            <w:insideV w:val="single" w:color="auto" w:sz="4" w:space="0"/>
+          </w:tblBorders>
+          <w:tblCellMar>
+            <w:top w:w="0" w:type="dxa"/>
+            <w:left w:w="108" w:type="dxa"/>
+            <w:bottom w:w="0" w:type="dxa"/>
+            <w:right w:w="108" w:type="dxa"/>
+          </w:tblCellMar>
+        </w:tblPrEx>
+        <w:tc>
+          <w:tcPr>
+            <w:tcW w:w="1450" w:type="dxa"/>
+          </w:tcPr>
+          <w:p>
+            <w:pPr>
+              <w:jc w:val="both"/>
+              <w:rPr>
+                <w:rFonts w:hint="default"/>
+                <w:vertAlign w:val="baseline"/>
+                <w:lang w:val="en-US"/>
+              </w:rPr>
+            </w:pPr>
+            <w:r>
+              <w:rPr>
+                <w:rFonts w:hint="default"/>
+                <w:b/>
+                <w:bCs/>
+                <w:lang w:val="en-US"/>
+              </w:rPr>
+              <w:t>{PatientID}</w:t>
+            </w:r>
+          </w:p>
+        </w:tc>
+        <w:tc>
+          <w:tcPr>
+            <w:tcW w:w="1902" w:type="dxa"/>
+          </w:tcPr>
+          <w:p>
+            <w:pPr>
+              <w:jc w:val="both"/>
+              <w:rPr>
+                <w:rFonts w:hint="default"/>
+                <w:vertAlign w:val="baseline"/>
+                <w:lang w:val="en-US"/>
+              </w:rPr>
+            </w:pPr>
+            <w:r>
+              <w:rPr>
+                <w:rFonts w:hint="default"/>
+                <w:lang w:val="en-US"/>
+              </w:rPr>
+              <w:t>{PatientIDValue}</w:t>
+            </w:r>
+          </w:p>
+        </w:tc>
+        <w:tc>
+          <w:tcPr>
+            <w:tcW w:w="1821" w:type="dxa"/>
+          </w:tcPr>
+          <w:p>
+            <w:pPr>
+              <w:jc w:val="both"/>
+              <w:rPr>
+                <w:rFonts w:hint="default"/>
+                <w:vertAlign w:val="baseline"/>
+                <w:lang w:val="en-US"/>
+              </w:rPr>
+            </w:pPr>
+            <w:r>
+              <w:rPr>
+                <w:rFonts w:hint="default"/>
+                <w:b/>
+                <w:bCs/>
+                <w:lang w:val="en-US"/>
+              </w:rPr>
+              <w:t>{Accessio</w:t>
+            </w:r>
+            <w:bookmarkStart w:id="0" w:name="_GoBack"/>
+            <w:bookmarkEnd w:id="0"/>
+            <w:r>
+              <w:rPr>
+                <w:rFonts w:hint="default"/>
+                <w:b/>
+                <w:bCs/>
+                <w:lang w:val="en-US"/>
+              </w:rPr>
+              <w:t>nNumber}</w:t>
+            </w:r>
+          </w:p>
+        </w:tc>
+        <w:tc>
+          <w:tcPr>
+            <w:tcW w:w="2272" w:type="dxa"/>
+          </w:tcPr>
+          <w:p>
+            <w:pPr>
+              <w:jc w:val="both"/>
+              <w:rPr>
+                <w:rFonts w:hint="default"/>
+                <w:vertAlign w:val="baseline"/>
+                <w:lang w:val="en-US"/>
+              </w:rPr>
+            </w:pPr>
+            <w:r>
+              <w:rPr>
+                <w:rFonts w:hint="default"/>
+                <w:lang w:val="en-US"/>
+              </w:rPr>
+              <w:t>{AccessionNumberValue}</w:t>
+            </w:r>
+          </w:p>
+        </w:tc>
+        <w:tc>
+          <w:tcPr>
+            <w:tcW w:w="1338" w:type="dxa"/>
+          </w:tcPr>
+          <w:p>
+            <w:pPr>
+              <w:jc w:val="both"/>
+              <w:rPr>
+                <w:rFonts w:hint="default"/>
+                <w:vertAlign w:val="baseline"/>
+                <w:lang w:val="en-US"/>
+              </w:rPr>
+            </w:pPr>
+            <w:r>
+              <w:rPr>
+                <w:rFonts w:hint="default"/>
+                <w:b/>
+                <w:bCs/>
+                <w:lang w:val="en-US"/>
+              </w:rPr>
+              <w:t>{StudyDate}</w:t>
+            </w:r>
+          </w:p>
+        </w:tc>
+        <w:tc>
+          <w:tcPr>
+            <w:tcW w:w="1680" w:type="dxa"/>
+          </w:tcPr>
+          <w:p>
+            <w:pPr>
+              <w:jc w:val="both"/>
+              <w:rPr>
+                <w:rFonts w:hint="default"/>
+                <w:vertAlign w:val="baseline"/>
+                <w:lang w:val="en-US"/>
+              </w:rPr>
+            </w:pPr>
+            <w:r>
+              <w:rPr>
+                <w:rFonts w:hint="default"/>
+                <w:vertAlign w:val="baseline"/>
+                <w:lang w:val="en-US"/>
+              </w:rPr>
+              <w:t>{</w:t>
+            </w:r>
+            <w:r>
+              <w:rPr>
+                <w:rFonts w:hint="default"/>
+                <w:lang w:val="en-US"/>
+              </w:rPr>
+              <w:t>StudyDateValue}</w:t>
+            </w:r>
+          </w:p>
+        </w:tc>
+      </w:tr>
+      <w:tr>
+        <w:tblPrEx>
+          <w:tblBorders>
+            <w:top w:val="single" w:color="auto" w:sz="4" w:space="0"/>
+            <w:left w:val="single" w:color="auto" w:sz="4" w:space="0"/>
+            <w:bottom w:val="single" w:color="auto" w:sz="4" w:space="0"/>
+            <w:right w:val="single" w:color="auto" w:sz="4" w:space="0"/>
+            <w:insideH w:val="single" w:color="auto" w:sz="4" w:space="0"/>
+            <w:insideV w:val="single" w:color="auto" w:sz="4" w:space="0"/>
+          </w:tblBorders>
+          <w:tblCellMar>
+            <w:top w:w="0" w:type="dxa"/>
+            <w:left w:w="108" w:type="dxa"/>
+            <w:bottom w:w="0" w:type="dxa"/>
+            <w:right w:w="108" w:type="dxa"/>
+          </w:tblCellMar>
+        </w:tblPrEx>
+        <w:tc>
+          <w:tcPr>
+            <w:tcW w:w="1450" w:type="dxa"/>
+          </w:tcPr>
+          <w:p>
+            <w:pPr>
+              <w:jc w:val="both"/>
+              <w:rPr>
+                <w:rFonts w:hint="default"/>
+                <w:vertAlign w:val="baseline"/>
+                <w:lang w:val="en-US"/>
+              </w:rPr>
+            </w:pPr>
+            <w:r>
+              <w:rPr>
+                <w:rFonts w:hint="default"/>
+                <w:b/>
+                <w:bCs/>
+                <w:lang w:val="en-US"/>
+              </w:rPr>
+              <w:t>{PatientName}</w:t>
+            </w:r>
+          </w:p>
+        </w:tc>
+        <w:tc>
+          <w:tcPr>
+            <w:tcW w:w="1902" w:type="dxa"/>
+          </w:tcPr>
+          <w:p>
+            <w:pPr>
+              <w:jc w:val="both"/>
+              <w:rPr>
+                <w:rFonts w:hint="default"/>
+                <w:vertAlign w:val="baseline"/>
+                <w:lang w:val="en-US"/>
+              </w:rPr>
+            </w:pPr>
+            <w:r>
+              <w:rPr>
+                <w:rFonts w:hint="default"/>
+                <w:lang w:val="en-US"/>
+              </w:rPr>
+              <w:t>{PatientNameValue}</w:t>
+            </w:r>
+          </w:p>
+        </w:tc>
+        <w:tc>
+          <w:tcPr>
+            <w:tcW w:w="1821" w:type="dxa"/>
+          </w:tcPr>
+          <w:p>
+            <w:pPr>
+              <w:jc w:val="both"/>
+              <w:rPr>
+                <w:rFonts w:hint="default"/>
+                <w:vertAlign w:val="baseline"/>
+                <w:lang w:val="en-US"/>
+              </w:rPr>
+            </w:pPr>
+            <w:r>
+              <w:rPr>
+                <w:rFonts w:hint="default"/>
+                <w:b/>
+                <w:bCs/>
+                <w:vertAlign w:val="baseline"/>
+                <w:lang w:val="en-US"/>
+              </w:rPr>
+              <w:t>{PatientAge}</w:t>
+            </w:r>
+          </w:p>
+        </w:tc>
+        <w:tc>
+          <w:tcPr>
+            <w:tcW w:w="2272" w:type="dxa"/>
+          </w:tcPr>
+          <w:p>
+            <w:pPr>
+              <w:jc w:val="both"/>
+              <w:rPr>
+                <w:rFonts w:hint="default"/>
+                <w:vertAlign w:val="baseline"/>
+                <w:lang w:val="en-US"/>
+              </w:rPr>
+            </w:pPr>
+            <w:r>
+              <w:rPr>
+                <w:rFonts w:hint="default"/>
+                <w:vertAlign w:val="baseline"/>
+                <w:lang w:val="en-US"/>
+              </w:rPr>
+              <w:t>{PatientAgeValue}</w:t>
+            </w:r>
+          </w:p>
+        </w:tc>
+        <w:tc>
+          <w:tcPr>
+            <w:tcW w:w="1338" w:type="dxa"/>
+          </w:tcPr>
+          <w:p>
+            <w:pPr>
+              <w:jc w:val="both"/>
+              <w:rPr>
+                <w:rFonts w:hint="default"/>
+                <w:b/>
+                <w:bCs/>
+                <w:vertAlign w:val="baseline"/>
+                <w:lang w:val="en-US"/>
+              </w:rPr>
+            </w:pPr>
+            <w:r>
+              <w:rPr>
+                <w:rFonts w:hint="default"/>
+                <w:b/>
+                <w:bCs/>
+                <w:vertAlign w:val="baseline"/>
+                <w:lang w:val="en-US"/>
+              </w:rPr>
+              <w:t>{PatientSex}</w:t>
+            </w:r>
+          </w:p>
+        </w:tc>
+        <w:tc>
+          <w:tcPr>
+            <w:tcW w:w="1680" w:type="dxa"/>
+          </w:tcPr>
+          <w:p>
+            <w:pPr>
+              <w:jc w:val="both"/>
+              <w:rPr>
+                <w:rFonts w:hint="default"/>
+                <w:vertAlign w:val="baseline"/>
+                <w:lang w:val="en-US"/>
+              </w:rPr>
+            </w:pPr>
+            <w:r>
+              <w:rPr>
+                <w:rFonts w:hint="default"/>
+                <w:vertAlign w:val="baseline"/>
+                <w:lang w:val="en-US"/>
+              </w:rPr>
+              <w:t>{PatientSexValue}</w:t>
+            </w:r>
+          </w:p>
+        </w:tc>
+      </w:tr>
+      <w:tr>
+        <w:tblPrEx>
+          <w:tblBorders>
+            <w:top w:val="single" w:color="auto" w:sz="4" w:space="0"/>
+            <w:left w:val="single" w:color="auto" w:sz="4" w:space="0"/>
+            <w:bottom w:val="single" w:color="auto" w:sz="4" w:space="0"/>
+            <w:right w:val="single" w:color="auto" w:sz="4" w:space="0"/>
+            <w:insideH w:val="single" w:color="auto" w:sz="4" w:space="0"/>
+            <w:insideV w:val="single" w:color="auto" w:sz="4" w:space="0"/>
+          </w:tblBorders>
+          <w:tblCellMar>
+            <w:top w:w="0" w:type="dxa"/>
+            <w:left w:w="108" w:type="dxa"/>
+            <w:bottom w:w="0" w:type="dxa"/>
+            <w:right w:w="108" w:type="dxa"/>
+          </w:tblCellMar>
+        </w:tblPrEx>
+        <w:tc>
+          <w:tcPr>
+            <w:tcW w:w="1450" w:type="dxa"/>
+          </w:tcPr>
+          <w:p>
+            <w:pPr>
+              <w:jc w:val="both"/>
+              <w:rPr>
+                <w:rFonts w:hint="default"/>
+                <w:vertAlign w:val="baseline"/>
+                <w:lang w:val="en-US"/>
+              </w:rPr>
+            </w:pPr>
+            <w:r>
+              <w:rPr>
+                <w:rFonts w:hint="default"/>
+                <w:b/>
+                <w:bCs/>
+                <w:vertAlign w:val="baseline"/>
+                <w:lang w:val="en-US"/>
+              </w:rPr>
+              <w:t>{BirthDate}</w:t>
+            </w:r>
+          </w:p>
+        </w:tc>
+        <w:tc>
+          <w:tcPr>
+            <w:tcW w:w="1902" w:type="dxa"/>
+          </w:tcPr>
+          <w:p>
+            <w:pPr>
+              <w:jc w:val="both"/>
+              <w:rPr>
+                <w:rFonts w:hint="default"/>
+                <w:vertAlign w:val="baseline"/>
+                <w:lang w:val="en-US"/>
+              </w:rPr>
+            </w:pPr>
+            <w:r>
+              <w:rPr>
+                <w:rFonts w:hint="default"/>
+                <w:vertAlign w:val="baseline"/>
+                <w:lang w:val="en-US"/>
+              </w:rPr>
+              <w:t>{BirthDateValue}</w:t>
+            </w:r>
+          </w:p>
+        </w:tc>
+        <w:tc>
+          <w:tcPr>
+            <w:tcW w:w="1821" w:type="dxa"/>
+          </w:tcPr>
+          <w:p>
+            <w:pPr>
+              <w:jc w:val="both"/>
+              <w:rPr>
+                <w:rFonts w:hint="default"/>
+                <w:vertAlign w:val="baseline"/>
+                <w:lang w:val="en-US"/>
+              </w:rPr>
+            </w:pPr>
+            <w:r>
+              <w:rPr>
+                <w:rFonts w:hint="default"/>
+                <w:b/>
+                <w:bCs/>
+                <w:vertAlign w:val="baseline"/>
+                <w:lang w:val="en-US"/>
+              </w:rPr>
+              <w:t>{AnatomicalRegion}</w:t>
+            </w:r>
+          </w:p>
+        </w:tc>
+        <w:tc>
+          <w:tcPr>
+            <w:tcW w:w="2272" w:type="dxa"/>
+          </w:tcPr>
+          <w:p>
+            <w:pPr>
+              <w:jc w:val="both"/>
+              <w:rPr>
+                <w:rFonts w:hint="default"/>
+                <w:vertAlign w:val="baseline"/>
+                <w:lang w:val="en-US"/>
+              </w:rPr>
+            </w:pPr>
+            <w:r>
+              <w:rPr>
+                <w:rFonts w:hint="default"/>
+                <w:vertAlign w:val="baseline"/>
+                <w:lang w:val="en-US"/>
+              </w:rPr>
+              <w:t>{AnatomicalRegionValue}</w:t>
+            </w:r>
+          </w:p>
+        </w:tc>
+        <w:tc>
+          <w:tcPr>
+            <w:tcW w:w="1338" w:type="dxa"/>
+          </w:tcPr>
+          <w:p>
+            <w:pPr>
+              <w:jc w:val="both"/>
+              <w:rPr>
+                <w:rFonts w:hint="default"/>
+                <w:b/>
+                <w:bCs/>
+                <w:vertAlign w:val="baseline"/>
+                <w:lang w:val="en-US"/>
+              </w:rPr>
+            </w:pPr>
+            <w:r>
+              <w:rPr>
+                <w:rFonts w:hint="default"/>
+                <w:b/>
+                <w:bCs/>
+                <w:vertAlign w:val="baseline"/>
+                <w:lang w:val="en-US"/>
+              </w:rPr>
+              <w:t>{Department}</w:t>
+            </w:r>
+          </w:p>
+        </w:tc>
+        <w:tc>
+          <w:tcPr>
+            <w:tcW w:w="1680" w:type="dxa"/>
+          </w:tcPr>
+          <w:p>
+            <w:pPr>
+              <w:jc w:val="both"/>
+              <w:rPr>
+                <w:rFonts w:hint="default"/>
+                <w:vertAlign w:val="baseline"/>
+                <w:lang w:val="en-US"/>
+              </w:rPr>
+            </w:pPr>
+            <w:r>
+              <w:rPr>
+                <w:rFonts w:hint="default"/>
+                <w:vertAlign w:val="baseline"/>
+                <w:lang w:val="en-US"/>
+              </w:rPr>
+              <w:t>{DepartmentValue}</w:t>
+            </w:r>
+          </w:p>
+        </w:tc>
+      </w:tr>
+      <w:tr>
+        <w:tblPrEx>
+          <w:tblBorders>
+            <w:top w:val="single" w:color="auto" w:sz="4" w:space="0"/>
+            <w:left w:val="single" w:color="auto" w:sz="4" w:space="0"/>
+            <w:bottom w:val="single" w:color="auto" w:sz="4" w:space="0"/>
+            <w:right w:val="single" w:color="auto" w:sz="4" w:space="0"/>
+            <w:insideH w:val="single" w:color="auto" w:sz="4" w:space="0"/>
+            <w:insideV w:val="single" w:color="auto" w:sz="4" w:space="0"/>
+          </w:tblBorders>
+          <w:tblCellMar>
+            <w:top w:w="0" w:type="dxa"/>
+            <w:left w:w="108" w:type="dxa"/>
+            <w:bottom w:w="0" w:type="dxa"/>
+            <w:right w:w="108" w:type="dxa"/>
+          </w:tblCellMar>
+        </w:tblPrEx>
+        <w:tc>
+          <w:tcPr>
+            <w:tcW w:w="1450" w:type="dxa"/>
+          </w:tcPr>
+          <w:p>
+            <w:pPr>
+              <w:jc w:val="both"/>
+              <w:rPr>
+                <w:rFonts w:hint="default"/>
+                <w:vertAlign w:val="baseline"/>
+                <w:lang w:val="en-US"/>
+              </w:rPr>
+            </w:pPr>
+            <w:r>
+              <w:rPr>
+                <w:rFonts w:hint="default"/>
+                <w:b/>
+                <w:bCs/>
+                <w:vertAlign w:val="baseline"/>
+                <w:lang w:val="en-US"/>
+              </w:rPr>
+              <w:t>{ClinicNumber}</w:t>
+            </w:r>
+          </w:p>
+        </w:tc>
+        <w:tc>
+          <w:tcPr>
+            <w:tcW w:w="1902" w:type="dxa"/>
+          </w:tcPr>
+          <w:p>
+            <w:pPr>
+              <w:jc w:val="both"/>
+              <w:rPr>
+                <w:rFonts w:hint="default"/>
+                <w:vertAlign w:val="baseline"/>
+                <w:lang w:val="en-US"/>
+              </w:rPr>
+            </w:pPr>
+            <w:r>
+              <w:rPr>
+                <w:rFonts w:hint="default"/>
+                <w:vertAlign w:val="baseline"/>
+                <w:lang w:val="en-US"/>
+              </w:rPr>
+              <w:t>{ClinicNumberValue}</w:t>
+            </w:r>
+          </w:p>
+        </w:tc>
+        <w:tc>
+          <w:tcPr>
+            <w:tcW w:w="1821" w:type="dxa"/>
+          </w:tcPr>
+          <w:p>
+            <w:pPr>
+              <w:jc w:val="both"/>
+              <w:rPr>
+                <w:rFonts w:hint="default"/>
+                <w:b/>
+                <w:bCs/>
+                <w:vertAlign w:val="baseline"/>
+                <w:lang w:val="en-US"/>
+              </w:rPr>
+            </w:pPr>
+            <w:r>
+              <w:rPr>
+                <w:rFonts w:hint="default"/>
+                <w:b/>
+                <w:bCs/>
+                <w:vertAlign w:val="baseline"/>
+                <w:lang w:val="en-US"/>
+              </w:rPr>
+              <w:t>{InNumber}</w:t>
+            </w:r>
+          </w:p>
+        </w:tc>
+        <w:tc>
+          <w:tcPr>
+            <w:tcW w:w="2272" w:type="dxa"/>
+          </w:tcPr>
+          <w:p>
+            <w:pPr>
+              <w:jc w:val="both"/>
+              <w:rPr>
+                <w:rFonts w:hint="default"/>
+                <w:vertAlign w:val="baseline"/>
+                <w:lang w:val="en-US"/>
+              </w:rPr>
+            </w:pPr>
+            <w:r>
+              <w:rPr>
+                <w:rFonts w:hint="default"/>
+                <w:vertAlign w:val="baseline"/>
+                <w:lang w:val="en-US"/>
+              </w:rPr>
+              <w:t>{InNumberValue}</w:t>
+            </w:r>
+          </w:p>
+        </w:tc>
+        <w:tc>
+          <w:tcPr>
+            <w:tcW w:w="1338" w:type="dxa"/>
+          </w:tcPr>
+          <w:p>
+            <w:pPr>
+              <w:jc w:val="both"/>
+              <w:rPr>
+                <w:rFonts w:hint="default"/>
+                <w:b/>
+                <w:bCs/>
+                <w:vertAlign w:val="baseline"/>
+                <w:lang w:val="en-US"/>
+              </w:rPr>
+            </w:pPr>
+            <w:r>
+              <w:rPr>
+                <w:rFonts w:hint="default"/>
+                <w:b/>
+                <w:bCs/>
+                <w:vertAlign w:val="baseline"/>
+                <w:lang w:val="en-US"/>
+              </w:rPr>
+              <w:t>{BedNumber}</w:t>
+            </w:r>
+          </w:p>
+        </w:tc>
+        <w:tc>
+          <w:tcPr>
+            <w:tcW w:w="1680" w:type="dxa"/>
+          </w:tcPr>
+          <w:p>
+            <w:pPr>
+              <w:jc w:val="both"/>
+              <w:rPr>
+                <w:rFonts w:hint="default"/>
+                <w:vertAlign w:val="baseline"/>
+                <w:lang w:val="en-US"/>
+              </w:rPr>
+            </w:pPr>
+            <w:r>
+              <w:rPr>
+                <w:rFonts w:hint="default"/>
+                <w:vertAlign w:val="baseline"/>
+                <w:lang w:val="en-US"/>
+              </w:rPr>
+              <w:t>{BedNumberValue}</w:t>
+            </w:r>
+          </w:p>
+        </w:tc>
+      </w:tr>
+    </w:tbl>
+    <w:p>
+      <w:pPr>
+        <w:jc w:val="both"/>
+        <w:rPr>
+          <w:rFonts w:hint="default"/>
+          <w:lang w:val="en-US"/>
+        </w:rPr>
+      </w:pPr>
+    </w:p>
+    <w:p>
+      <w:pPr>
+        <w:jc w:val="both"/>
+        <w:rPr>
+          <w:rFonts w:hint="default" w:eastAsiaTheme="minorEastAsia"/>
+          <w:lang w:val="en-US" w:eastAsia="zh-CN"/>
+        </w:rPr>
+      </w:pPr>
+      <w:r>
         <w:rPr>
           <w:rFonts w:hint="eastAsia"/>
-        </w:rPr>
-      </w:pPr>
+          <w:lang w:val="en-US" w:eastAsia="zh-CN"/>
+        </w:rPr>
+        <w:t>{</w:t>
+      </w:r>
       <w:r>
         <w:rPr>
+          <w:rFonts w:hint="default"/>
+          <w:lang w:val="en-US" w:eastAsia="zh-CN"/>
+        </w:rPr>
+        <w:t>ImagesPlaceholder</w:t>
+      </w:r>
+      <w:r>
+        <w:rPr>
           <w:rFonts w:hint="eastAsia"/>
-        </w:rPr>
-        <w:t>Hello {Name},</w:t>
+          <w:lang w:val="en-US" w:eastAsia="zh-CN"/>
+        </w:rPr>
+        <w:t>}</w:t>
       </w:r>
     </w:p>
     <w:p>
       <w:pPr>
-        <w:rPr>
-          <w:rFonts w:hint="eastAsia"/>
-        </w:rPr>
-      </w:pPr>
-    </w:p>
-    <w:p>
-      <w:pPr>
-        <w:rPr>
-          <w:rFonts w:hint="eastAsia"/>
+        <w:jc w:val="both"/>
+        <w:rPr>
+          <w:rFonts w:hint="default"/>
+          <w:lang w:val="en-US"/>
+        </w:rPr>
+      </w:pPr>
+    </w:p>
+    <w:p>
+      <w:pPr>
+        <w:pBdr>
+          <w:bottom w:val="single" w:color="auto" w:sz="4" w:space="0"/>
+        </w:pBdr>
+        <w:jc w:val="both"/>
+        <w:rPr>
+          <w:rFonts w:hint="default"/>
+          <w:b/>
+          <w:bCs/>
+          <w:lang w:val="en-US"/>
         </w:rPr>
       </w:pPr>
       <w:r>
         <w:rPr>
-          <w:rFonts w:hint="eastAsia"/>
-        </w:rPr>
-        <w:t>Your appointment is scheduled for {Date}.</w:t>
+          <w:rFonts w:hint="default"/>
+          <w:b/>
+          <w:bCs/>
+          <w:lang w:val="en-US"/>
+        </w:rPr>
+        <w:t>{DiagnosticOpinion}</w:t>
       </w:r>
     </w:p>
     <w:p>
       <w:pPr>
-        <w:rPr>
-          <w:rFonts w:hint="eastAsia"/>
-        </w:rPr>
-      </w:pPr>
-    </w:p>
-    <w:p>
-      <w:pPr>
-        <w:rPr>
-          <w:rFonts w:hint="eastAsia"/>
+        <w:jc w:val="both"/>
+        <w:rPr>
+          <w:rFonts w:hint="default"/>
+          <w:lang w:val="en-US"/>
         </w:rPr>
       </w:pPr>
       <w:r>
         <w:rPr>
-          <w:rFonts w:hint="eastAsia"/>
-        </w:rPr>
-        <w:t>Best regards,</w:t>
+          <w:rFonts w:hint="default"/>
+          <w:lang w:val="en-US"/>
+        </w:rPr>
+        <w:t>{DiagnosticOpinionValue}</w:t>
       </w:r>
     </w:p>
     <w:p>
       <w:pPr>
-        <w:rPr>
-          <w:rFonts w:hint="eastAsia"/>
+        <w:jc w:val="both"/>
+        <w:rPr>
+          <w:rFonts w:hint="default"/>
+          <w:lang w:val="en-US"/>
+        </w:rPr>
+      </w:pPr>
+    </w:p>
+    <w:p>
+      <w:pPr>
+        <w:pBdr>
+          <w:bottom w:val="single" w:color="auto" w:sz="4" w:space="0"/>
+        </w:pBdr>
+        <w:jc w:val="both"/>
+        <w:rPr>
+          <w:rFonts w:hint="default"/>
+          <w:b/>
+          <w:bCs/>
+          <w:lang w:val="en-US"/>
         </w:rPr>
       </w:pPr>
       <w:r>
         <w:rPr>
-          <w:rFonts w:hint="eastAsia"/>
-        </w:rPr>
-        <w:t>Your Company</w:t>
+          <w:rFonts w:hint="default"/>
+          <w:b/>
+          <w:bCs/>
+          <w:lang w:val="en-US"/>
+        </w:rPr>
+        <w:t>{ImageFindings}</w:t>
       </w:r>
     </w:p>
     <w:p>
-      <w:bookmarkStart w:id="0" w:name="_GoBack"/>
-      <w:bookmarkEnd w:id="0"/>
+      <w:pPr>
+        <w:jc w:val="both"/>
+        <w:rPr>
+          <w:rFonts w:hint="default"/>
+          <w:lang w:val="en-US"/>
+        </w:rPr>
+      </w:pPr>
+      <w:r>
+        <w:rPr>
+          <w:rFonts w:hint="default"/>
+          <w:lang w:val="en-US"/>
+        </w:rPr>
+        <w:t>{ImageFindingsValue}</w:t>
+      </w:r>
+    </w:p>
+    <w:p>
+      <w:pPr>
+        <w:pBdr>
+          <w:bottom w:val="single" w:color="auto" w:sz="4" w:space="0"/>
+        </w:pBdr>
+        <w:jc w:val="both"/>
+        <w:rPr>
+          <w:rFonts w:hint="default"/>
+          <w:lang w:val="en-US"/>
+        </w:rPr>
+      </w:pPr>
+    </w:p>
+    <w:p>
+      <w:pPr>
+        <w:jc w:val="right"/>
+        <w:rPr>
+          <w:rFonts w:hint="default"/>
+          <w:lang w:val="en-US"/>
+        </w:rPr>
+      </w:pPr>
+      <w:r>
+        <w:rPr>
+          <w:rFonts w:hint="default"/>
+          <w:b/>
+          <w:bCs/>
+          <w:lang w:val="en-US"/>
+        </w:rPr>
+        <w:t>{Physician}</w:t>
+      </w:r>
+      <w:r>
+        <w:rPr>
+          <w:rFonts w:hint="default"/>
+          <w:lang w:val="en-US"/>
+        </w:rPr>
+        <w:t>:{PhysicianValue}</w:t>
+      </w:r>
+    </w:p>
+    <w:p>
+      <w:pPr>
+        <w:jc w:val="right"/>
+        <w:rPr>
+          <w:rFonts w:hint="default"/>
+          <w:lang w:val="en-US"/>
+        </w:rPr>
+      </w:pPr>
+      <w:r>
+        <w:rPr>
+          <w:rFonts w:hint="default"/>
+          <w:b/>
+          <w:bCs/>
+          <w:lang w:val="en-US"/>
+        </w:rPr>
+        <w:t>{ReportDate}</w:t>
+      </w:r>
+      <w:r>
+        <w:rPr>
+          <w:rFonts w:hint="default"/>
+          <w:lang w:val="en-US"/>
+        </w:rPr>
+        <w:t>:{ReportDateValue}</w:t>
+      </w:r>
+    </w:p>
+    <w:p>
+      <w:pPr>
+        <w:jc w:val="both"/>
+        <w:rPr>
+          <w:rFonts w:hint="default"/>
+          <w:lang w:val="en-US"/>
+        </w:rPr>
+      </w:pPr>
+    </w:p>
+    <w:p>
+      <w:pPr>
+        <w:jc w:val="both"/>
+        <w:rPr>
+          <w:rFonts w:hint="default"/>
+          <w:lang w:val="en-US"/>
+        </w:rPr>
+      </w:pPr>
+    </w:p>
+    <w:p>
+      <w:pPr>
+        <w:jc w:val="both"/>
+        <w:rPr>
+          <w:rFonts w:hint="default"/>
+          <w:lang w:val="en-US"/>
+        </w:rPr>
+      </w:pPr>
+    </w:p>
+    <w:p>
+      <w:pPr>
+        <w:jc w:val="both"/>
+        <w:rPr>
+          <w:rFonts w:hint="default"/>
+          <w:lang w:val="en-US"/>
+        </w:rPr>
+      </w:pPr>
+    </w:p>
+    <w:p>
+      <w:pPr>
+        <w:jc w:val="both"/>
+        <w:rPr>
+          <w:rFonts w:hint="default"/>
+          <w:lang w:val="en-US"/>
+        </w:rPr>
+      </w:pPr>
+    </w:p>
+    <w:p>
+      <w:pPr>
+        <w:jc w:val="both"/>
+        <w:rPr>
+          <w:rFonts w:hint="default"/>
+          <w:lang w:val="en-US"/>
+        </w:rPr>
+      </w:pPr>
+    </w:p>
+    <w:p>
+      <w:pPr>
+        <w:jc w:val="both"/>
+        <w:rPr>
+          <w:rFonts w:hint="default"/>
+          <w:lang w:val="en-US"/>
+        </w:rPr>
+      </w:pPr>
+    </w:p>
+    <w:p>
+      <w:pPr>
+        <w:jc w:val="both"/>
+        <w:rPr>
+          <w:rFonts w:hint="default"/>
+          <w:lang w:val="en-US"/>
+        </w:rPr>
+      </w:pPr>
+    </w:p>
+    <w:p>
+      <w:pPr>
+        <w:jc w:val="both"/>
+        <w:rPr>
+          <w:rFonts w:hint="default"/>
+          <w:lang w:val="en-US"/>
+        </w:rPr>
+      </w:pPr>
+    </w:p>
+    <w:p>
+      <w:pPr>
+        <w:jc w:val="both"/>
+        <w:rPr>
+          <w:rFonts w:hint="default"/>
+          <w:lang w:val="en-US"/>
+        </w:rPr>
+      </w:pPr>
+    </w:p>
+    <w:p>
+      <w:pPr>
+        <w:jc w:val="both"/>
+        <w:rPr>
+          <w:rFonts w:hint="default"/>
+          <w:lang w:val="en-US"/>
+        </w:rPr>
+      </w:pPr>
+    </w:p>
+    <w:p>
+      <w:pPr>
+        <w:jc w:val="both"/>
+        <w:rPr>
+          <w:rFonts w:hint="default"/>
+          <w:lang w:val="en-US"/>
+        </w:rPr>
+      </w:pPr>
+    </w:p>
+    <w:p>
+      <w:pPr>
+        <w:jc w:val="both"/>
+        <w:rPr>
+          <w:rFonts w:hint="default"/>
+          <w:lang w:val="en-US"/>
+        </w:rPr>
+      </w:pPr>
+    </w:p>
+    <w:p>
+      <w:pPr>
+        <w:jc w:val="both"/>
+        <w:rPr>
+          <w:rFonts w:hint="default"/>
+          <w:lang w:val="en-US"/>
+        </w:rPr>
+      </w:pPr>
+    </w:p>
+    <w:p>
+      <w:pPr>
+        <w:jc w:val="both"/>
+        <w:rPr>
+          <w:rFonts w:hint="default"/>
+          <w:lang w:val="en-US"/>
+        </w:rPr>
+      </w:pPr>
+    </w:p>
+    <w:p>
+      <w:pPr>
+        <w:jc w:val="both"/>
+        <w:rPr>
+          <w:rFonts w:hint="default"/>
+          <w:lang w:val="en-US"/>
+        </w:rPr>
+      </w:pPr>
     </w:p>
     <w:sectPr>
       <w:pgSz w:w="11906" w:h="16838"/>
-      <w:pgMar w:top="1440" w:right="1800" w:bottom="1440" w:left="1800" w:header="851" w:footer="992" w:gutter="0"/>
+      <w:pgMar w:top="720" w:right="720" w:bottom="720" w:left="720" w:header="851" w:footer="992" w:gutter="0"/>
       <w:cols w:space="425" w:num="1"/>
       <w:docGrid w:type="lines" w:linePitch="312" w:charSpace="0"/>
     </w:sectPr>
@@ -95,7 +1084,7 @@
   <w:latentStyles w:count="260" w:defQFormat="0" w:defUnhideWhenUsed="1" w:defSemiHidden="1" w:defUIPriority="99" w:defLockedState="0">
     <w:lsdException w:qFormat="1" w:unhideWhenUsed="0" w:uiPriority="0" w:semiHidden="0" w:name="Normal"/>
     <w:lsdException w:qFormat="1" w:unhideWhenUsed="0" w:uiPriority="0" w:semiHidden="0" w:name="heading 1"/>
-    <w:lsdException w:qFormat="1" w:uiPriority="0" w:name="heading 2"/>
+    <w:lsdException w:qFormat="1" w:uiPriority="0" w:semiHidden="0" w:name="heading 2"/>
     <w:lsdException w:qFormat="1" w:uiPriority="0" w:name="heading 3"/>
     <w:lsdException w:qFormat="1" w:uiPriority="0" w:name="heading 4"/>
     <w:lsdException w:qFormat="1" w:uiPriority="0" w:name="heading 5"/>
@@ -241,7 +1230,7 @@
     <w:lsdException w:unhideWhenUsed="0" w:uiPriority="0" w:semiHidden="0" w:name="Table Web 2"/>
     <w:lsdException w:unhideWhenUsed="0" w:uiPriority="0" w:semiHidden="0" w:name="Table Web 3"/>
     <w:lsdException w:unhideWhenUsed="0" w:uiPriority="0" w:semiHidden="0" w:name="Balloon Text"/>
-    <w:lsdException w:unhideWhenUsed="0" w:uiPriority="0" w:semiHidden="0" w:name="Table Grid"/>
+    <w:lsdException w:qFormat="1" w:unhideWhenUsed="0" w:uiPriority="0" w:semiHidden="0" w:name="Table Grid"/>
     <w:lsdException w:unhideWhenUsed="0" w:uiPriority="0" w:semiHidden="0" w:name="Table Theme"/>
     <w:lsdException w:unhideWhenUsed="0" w:uiPriority="60" w:semiHidden="0" w:name="Light Shading"/>
     <w:lsdException w:unhideWhenUsed="0" w:uiPriority="61" w:semiHidden="0" w:name="Light List"/>
@@ -358,12 +1347,49 @@
       <w:lang w:val="en-US" w:eastAsia="zh-CN" w:bidi="ar-SA"/>
     </w:rPr>
   </w:style>
-  <w:style w:type="character" w:default="1" w:styleId="3">
+  <w:style w:type="paragraph" w:styleId="2">
+    <w:name w:val="heading 1"/>
+    <w:basedOn w:val="1"/>
+    <w:next w:val="1"/>
+    <w:qFormat/>
+    <w:uiPriority w:val="0"/>
+    <w:pPr>
+      <w:keepNext/>
+      <w:keepLines/>
+      <w:spacing w:before="340" w:beforeLines="0" w:beforeAutospacing="0" w:after="330" w:afterLines="0" w:afterAutospacing="0" w:line="576" w:lineRule="auto"/>
+      <w:outlineLvl w:val="0"/>
+    </w:pPr>
+    <w:rPr>
+      <w:b/>
+      <w:kern w:val="44"/>
+      <w:sz w:val="44"/>
+    </w:rPr>
+  </w:style>
+  <w:style w:type="paragraph" w:styleId="3">
+    <w:name w:val="heading 2"/>
+    <w:basedOn w:val="1"/>
+    <w:next w:val="1"/>
+    <w:unhideWhenUsed/>
+    <w:qFormat/>
+    <w:uiPriority w:val="0"/>
+    <w:pPr>
+      <w:keepNext/>
+      <w:keepLines/>
+      <w:spacing w:before="260" w:beforeLines="0" w:beforeAutospacing="0" w:after="260" w:afterLines="0" w:afterAutospacing="0" w:line="413" w:lineRule="auto"/>
+      <w:outlineLvl w:val="1"/>
+    </w:pPr>
+    <w:rPr>
+      <w:rFonts w:ascii="Arial" w:hAnsi="Arial" w:eastAsia="黑体"/>
+      <w:b/>
+      <w:sz w:val="32"/>
+    </w:rPr>
+  </w:style>
+  <w:style w:type="character" w:default="1" w:styleId="6">
     <w:name w:val="Default Paragraph Font"/>
     <w:semiHidden/>
     <w:uiPriority w:val="0"/>
   </w:style>
-  <w:style w:type="table" w:default="1" w:styleId="2">
+  <w:style w:type="table" w:default="1" w:styleId="4">
     <w:name w:val="Normal Table"/>
     <w:semiHidden/>
     <w:qFormat/>
@@ -375,6 +1401,26 @@
         <w:bottom w:w="0" w:type="dxa"/>
         <w:right w:w="108" w:type="dxa"/>
       </w:tblCellMar>
+    </w:tblPr>
+  </w:style>
+  <w:style w:type="table" w:styleId="5">
+    <w:name w:val="Table Grid"/>
+    <w:basedOn w:val="4"/>
+    <w:qFormat/>
+    <w:uiPriority w:val="0"/>
+    <w:pPr>
+      <w:widowControl w:val="0"/>
+      <w:jc w:val="both"/>
+    </w:pPr>
+    <w:tblPr>
+      <w:tblBorders>
+        <w:top w:val="single" w:color="auto" w:sz="4" w:space="0"/>
+        <w:left w:val="single" w:color="auto" w:sz="4" w:space="0"/>
+        <w:bottom w:val="single" w:color="auto" w:sz="4" w:space="0"/>
+        <w:right w:val="single" w:color="auto" w:sz="4" w:space="0"/>
+        <w:insideH w:val="single" w:color="auto" w:sz="4" w:space="0"/>
+        <w:insideV w:val="single" w:color="auto" w:sz="4" w:space="0"/>
+      </w:tblBorders>
     </w:tblPr>
   </w:style>
 </w:styles>

</xml_diff>